<commit_message>
Polish resume layout for professional alignment
Rebuild CV with consistent left/right columns for titles and dates,
clean section underlines, hanging bullets, and tighter typography so
the page reads as a neat one-page professional resume.

Co-authored-by: Pritam Nayak <erPritamNayak@users.noreply.github.com>
</commit_message>
<xml_diff>
--- a/AMIYA_Resume.docx
+++ b/AMIYA_Resume.docx
@@ -4,39 +4,65 @@
   <w:body>
     <w:p>
       <w:pPr>
+        <w:spacing w:after="40"/>
         <w:jc w:val="center"/>
       </w:pPr>
       <w:r>
         <w:rPr>
+          <w:rFonts w:ascii="Calibri" w:hAnsi="Calibri" w:eastAsia="Calibri"/>
           <w:b/>
-          <w:color w:val="1A365D"/>
-          <w:sz w:val="36"/>
+          <w:i w:val="0"/>
+          <w:color w:val="0F2942"/>
+          <w:sz w:val="40"/>
         </w:rPr>
         <w:t>AMIYA SAMAL</w:t>
       </w:r>
     </w:p>
     <w:p>
       <w:pPr>
+        <w:spacing w:after="0"/>
         <w:jc w:val="center"/>
       </w:pPr>
       <w:r>
         <w:rPr>
-          <w:color w:val="333333"/>
+          <w:rFonts w:ascii="Calibri" w:hAnsi="Calibri" w:eastAsia="Calibri"/>
+          <w:b w:val="0"/>
+          <w:i w:val="0"/>
+          <w:color w:val="555555"/>
           <w:sz w:val="18"/>
         </w:rPr>
-        <w:t>amiyasamal833@gmail.com  |  +91 8144928667  |  Bhubaneswar, Odisha, India</w:t>
-        <w:br/>
+        <w:t>amiyasamal833@gmail.com  •  +91 8144928667  •  Bhubaneswar, Odisha, India</w:t>
+      </w:r>
+    </w:p>
+    <w:p>
+      <w:pPr>
+        <w:spacing w:after="80"/>
+        <w:jc w:val="center"/>
+      </w:pPr>
+      <w:r>
+        <w:rPr>
+          <w:rFonts w:ascii="Calibri" w:hAnsi="Calibri" w:eastAsia="Calibri"/>
+          <w:b w:val="0"/>
+          <w:i w:val="0"/>
+          <w:color w:val="555555"/>
+          <w:sz w:val="18"/>
+        </w:rPr>
         <w:t>linkedin.com/in/amiyasamal</w:t>
       </w:r>
     </w:p>
     <w:p>
       <w:pPr>
         <w:spacing w:before="200" w:after="40"/>
+        <w:pBdr>
+          <w:bottom w:val="single" w:sz="12" w:space="1" w:color="1B4F72"/>
+        </w:pBdr>
       </w:pPr>
       <w:r>
         <w:rPr>
+          <w:rFonts w:ascii="Calibri" w:hAnsi="Calibri" w:eastAsia="Calibri"/>
           <w:b/>
-          <w:color w:val="1A365D"/>
+          <w:i w:val="0"/>
+          <w:color w:val="0F2942"/>
           <w:sz w:val="22"/>
         </w:rPr>
         <w:t>ABOUT ME</w:t>
@@ -44,35 +70,31 @@
     </w:p>
     <w:p>
       <w:pPr>
-        <w:spacing w:before="0" w:after="80"/>
+        <w:spacing w:before="80" w:after="40"/>
       </w:pPr>
       <w:r>
         <w:rPr>
-          <w:color w:val="1A365D"/>
-          <w:sz w:val="12"/>
-        </w:rPr>
-        <w:t>──────────────────────────────────────────────────────────────────────────────</w:t>
-      </w:r>
-    </w:p>
-    <w:p>
-      <w:pPr>
-        <w:spacing w:after="80"/>
-      </w:pPr>
-      <w:r>
-        <w:rPr>
+          <w:rFonts w:ascii="Calibri" w:hAnsi="Calibri" w:eastAsia="Calibri"/>
+          <w:b w:val="0"/>
+          <w:i w:val="0"/>
           <w:sz w:val="19"/>
         </w:rPr>
-        <w:t>Motivated and detail-oriented fresher with a strong passion for software development. Enthusiastic about learning new technologies and applying problem-solving skills to real-world challenges. Passionate about full-stack development, particularly the MERN stack, and eager to work on innovative projects that enhance user experience and efficiency. A quick learner with strong analytical skills and a collaborative mindset, aiming to apply technical skills to real-world applications.</w:t>
+        <w:t>Motivated and detail-oriented fresher with a strong passion for software development. Enthusiastic about learning new technologies and applying problem-solving skills to real-world challenges. Passionate about full-stack development, particularly the MERN stack, and eager to work on innovative projects that enhance user experience and efficiency. A quick learner with strong analytical skills and a collaborative mindset.</w:t>
       </w:r>
     </w:p>
     <w:p>
       <w:pPr>
         <w:spacing w:before="200" w:after="40"/>
+        <w:pBdr>
+          <w:bottom w:val="single" w:sz="12" w:space="1" w:color="1B4F72"/>
+        </w:pBdr>
       </w:pPr>
       <w:r>
         <w:rPr>
+          <w:rFonts w:ascii="Calibri" w:hAnsi="Calibri" w:eastAsia="Calibri"/>
           <w:b/>
-          <w:color w:val="1A365D"/>
+          <w:i w:val="0"/>
+          <w:color w:val="0F2942"/>
           <w:sz w:val="22"/>
         </w:rPr>
         <w:t>WORK EXPERIENCE</w:t>
@@ -80,36 +102,73 @@
     </w:p>
     <w:p>
       <w:pPr>
-        <w:spacing w:before="0" w:after="80"/>
+        <w:tabs>
+          <w:tab w:pos="9360" w:val="right"/>
+        </w:tabs>
+        <w:spacing w:before="40" w:after="0"/>
       </w:pPr>
       <w:r>
         <w:rPr>
-          <w:color w:val="1A365D"/>
-          <w:sz w:val="12"/>
+          <w:rFonts w:ascii="Calibri" w:hAnsi="Calibri" w:eastAsia="Calibri"/>
+          <w:b/>
+          <w:i w:val="0"/>
+          <w:color w:val="000000"/>
+          <w:sz w:val="20"/>
         </w:rPr>
-        <w:t>──────────────────────────────────────────────────────────────────────────────</w:t>
+        <w:t>Freelance Web Developer</w:t>
+      </w:r>
+      <w:r>
+        <w:rPr>
+          <w:rFonts w:ascii="Calibri" w:hAnsi="Calibri" w:eastAsia="Calibri"/>
+          <w:b w:val="0"/>
+          <w:i w:val="0"/>
+          <w:color w:val="555555"/>
+          <w:sz w:val="19"/>
+        </w:rPr>
+        <w:tab/>
+        <w:t>01/2024 – Present</w:t>
       </w:r>
     </w:p>
     <w:p>
       <w:pPr>
-        <w:spacing w:after="40" w:before="0"/>
+        <w:tabs>
+          <w:tab w:pos="9360" w:val="right"/>
+        </w:tabs>
+        <w:spacing w:before="40" w:after="0"/>
       </w:pPr>
       <w:r>
         <w:rPr>
-          <w:b/>
-          <w:sz w:val="20"/>
+          <w:rFonts w:ascii="Calibri" w:hAnsi="Calibri" w:eastAsia="Calibri"/>
+          <w:b w:val="0"/>
+          <w:i/>
+          <w:color w:val="333333"/>
+          <w:sz w:val="18"/>
         </w:rPr>
-        <w:t>FREELANCE WEB DEVELOPER  |  Self-Employed  |  01/2024 – Present</w:t>
+        <w:t>Self-Employed</w:t>
+      </w:r>
+      <w:r>
+        <w:rPr>
+          <w:rFonts w:ascii="Calibri" w:hAnsi="Calibri" w:eastAsia="Calibri"/>
+          <w:b w:val="0"/>
+          <w:i/>
+          <w:color w:val="555555"/>
+          <w:sz w:val="19"/>
+        </w:rPr>
+        <w:tab/>
+        <w:t>Bhubaneswar, India</w:t>
       </w:r>
     </w:p>
     <w:p>
       <w:pPr>
         <w:pStyle w:val="ListBullet"/>
-        <w:spacing w:after="40"/>
-        <w:ind w:left="360"/>
+        <w:spacing w:before="20" w:after="20"/>
+        <w:ind w:left="288"/>
       </w:pPr>
       <w:r>
         <w:rPr>
+          <w:rFonts w:ascii="Calibri" w:hAnsi="Calibri" w:eastAsia="Calibri"/>
+          <w:b w:val="0"/>
+          <w:i w:val="0"/>
           <w:sz w:val="19"/>
         </w:rPr>
         <w:t>Implemented responsive design techniques for better user experience.</w:t>
@@ -118,11 +177,14 @@
     <w:p>
       <w:pPr>
         <w:pStyle w:val="ListBullet"/>
-        <w:spacing w:after="40"/>
-        <w:ind w:left="360"/>
+        <w:spacing w:before="20" w:after="20"/>
+        <w:ind w:left="288"/>
       </w:pPr>
       <w:r>
         <w:rPr>
+          <w:rFonts w:ascii="Calibri" w:hAnsi="Calibri" w:eastAsia="Calibri"/>
+          <w:b w:val="0"/>
+          <w:i w:val="0"/>
           <w:sz w:val="19"/>
         </w:rPr>
         <w:t>Managed website hosting and maintenance for clients.</w:t>
@@ -131,11 +193,16 @@
     <w:p>
       <w:pPr>
         <w:spacing w:before="200" w:after="40"/>
+        <w:pBdr>
+          <w:bottom w:val="single" w:sz="12" w:space="1" w:color="1B4F72"/>
+        </w:pBdr>
       </w:pPr>
       <w:r>
         <w:rPr>
+          <w:rFonts w:ascii="Calibri" w:hAnsi="Calibri" w:eastAsia="Calibri"/>
           <w:b/>
-          <w:color w:val="1A365D"/>
+          <w:i w:val="0"/>
+          <w:color w:val="0F2942"/>
           <w:sz w:val="22"/>
         </w:rPr>
         <w:t>EDUCATION</w:t>
@@ -143,96 +210,191 @@
     </w:p>
     <w:p>
       <w:pPr>
-        <w:spacing w:before="0" w:after="80"/>
+        <w:tabs>
+          <w:tab w:pos="9360" w:val="right"/>
+        </w:tabs>
+        <w:spacing w:before="40" w:after="0"/>
       </w:pPr>
       <w:r>
         <w:rPr>
-          <w:color w:val="1A365D"/>
-          <w:sz w:val="12"/>
+          <w:rFonts w:ascii="Calibri" w:hAnsi="Calibri" w:eastAsia="Calibri"/>
+          <w:b/>
+          <w:i w:val="0"/>
+          <w:color w:val="000000"/>
+          <w:sz w:val="20"/>
         </w:rPr>
-        <w:t>──────────────────────────────────────────────────────────────────────────────</w:t>
+        <w:t>Bachelor of Technology in Computer Science</w:t>
+      </w:r>
+      <w:r>
+        <w:rPr>
+          <w:rFonts w:ascii="Calibri" w:hAnsi="Calibri" w:eastAsia="Calibri"/>
+          <w:b w:val="0"/>
+          <w:i w:val="0"/>
+          <w:color w:val="555555"/>
+          <w:sz w:val="19"/>
+        </w:rPr>
+        <w:tab/>
+        <w:t>2022 – 2026</w:t>
       </w:r>
     </w:p>
     <w:p>
       <w:pPr>
-        <w:spacing w:after="40" w:before="0"/>
+        <w:tabs>
+          <w:tab w:pos="9360" w:val="right"/>
+        </w:tabs>
+        <w:spacing w:before="40" w:after="0"/>
       </w:pPr>
       <w:r>
         <w:rPr>
-          <w:b/>
-          <w:sz w:val="20"/>
+          <w:rFonts w:ascii="Calibri" w:hAnsi="Calibri" w:eastAsia="Calibri"/>
+          <w:b w:val="0"/>
+          <w:i/>
+          <w:color w:val="333333"/>
+          <w:sz w:val="18"/>
         </w:rPr>
-        <w:t>Bachelor of Technology in Computer Science, GANDHI ENGINEERING COLLEGE  |  2022 – 2026</w:t>
+        <w:t>Gandhi Engineering College</w:t>
+      </w:r>
+      <w:r>
+        <w:rPr>
+          <w:rFonts w:ascii="Calibri" w:hAnsi="Calibri" w:eastAsia="Calibri"/>
+          <w:b w:val="0"/>
+          <w:i/>
+          <w:color w:val="555555"/>
+          <w:sz w:val="19"/>
+        </w:rPr>
+        <w:tab/>
+        <w:t>Bhubaneswar, Odisha</w:t>
       </w:r>
     </w:p>
     <w:p>
       <w:pPr>
-        <w:spacing w:after="40" w:before="0"/>
+        <w:tabs>
+          <w:tab w:pos="9360" w:val="right"/>
+        </w:tabs>
+        <w:spacing w:before="40" w:after="0"/>
       </w:pPr>
       <w:r>
         <w:rPr>
+          <w:rFonts w:ascii="Calibri" w:hAnsi="Calibri" w:eastAsia="Calibri"/>
+          <w:b/>
+          <w:i w:val="0"/>
+          <w:color w:val="000000"/>
+          <w:sz w:val="20"/>
+        </w:rPr>
+        <w:t>Intermediate in Science (ISC) — 70.33%</w:t>
+      </w:r>
+      <w:r>
+        <w:rPr>
+          <w:rFonts w:ascii="Calibri" w:hAnsi="Calibri" w:eastAsia="Calibri"/>
           <w:b w:val="0"/>
-          <w:sz w:val="18"/>
+          <w:i w:val="0"/>
+          <w:color w:val="555555"/>
+          <w:sz w:val="19"/>
         </w:rPr>
-        <w:t>Bhubaneswar, Odisha, India</w:t>
+        <w:tab/>
+        <w:t>2020 – 2022</w:t>
       </w:r>
     </w:p>
     <w:p>
       <w:pPr>
-        <w:spacing w:after="40" w:before="0"/>
+        <w:tabs>
+          <w:tab w:pos="9360" w:val="right"/>
+        </w:tabs>
+        <w:spacing w:before="40" w:after="0"/>
       </w:pPr>
       <w:r>
         <w:rPr>
-          <w:b/>
-          <w:sz w:val="20"/>
+          <w:rFonts w:ascii="Calibri" w:hAnsi="Calibri" w:eastAsia="Calibri"/>
+          <w:b w:val="0"/>
+          <w:i/>
+          <w:color w:val="333333"/>
+          <w:sz w:val="18"/>
         </w:rPr>
-        <w:t>Intermediate in Science (ISC) - Science, SADHU GOURESWAR COLLEGE  |  2020 – 2022 (70.33%)</w:t>
+        <w:t>Sadhu Goureswar College</w:t>
+      </w:r>
+      <w:r>
+        <w:rPr>
+          <w:rFonts w:ascii="Calibri" w:hAnsi="Calibri" w:eastAsia="Calibri"/>
+          <w:b w:val="0"/>
+          <w:i/>
+          <w:color w:val="555555"/>
+          <w:sz w:val="19"/>
+        </w:rPr>
+        <w:tab/>
+        <w:t>Jajpur, Odisha</w:t>
       </w:r>
     </w:p>
     <w:p>
       <w:pPr>
-        <w:spacing w:after="40" w:before="0"/>
+        <w:tabs>
+          <w:tab w:pos="9360" w:val="right"/>
+        </w:tabs>
+        <w:spacing w:before="40" w:after="0"/>
       </w:pPr>
       <w:r>
         <w:rPr>
+          <w:rFonts w:ascii="Calibri" w:hAnsi="Calibri" w:eastAsia="Calibri"/>
+          <w:b/>
+          <w:i w:val="0"/>
+          <w:color w:val="000000"/>
+          <w:sz w:val="20"/>
+        </w:rPr>
+        <w:t>High School Certificate — 68.83%</w:t>
+      </w:r>
+      <w:r>
+        <w:rPr>
+          <w:rFonts w:ascii="Calibri" w:hAnsi="Calibri" w:eastAsia="Calibri"/>
           <w:b w:val="0"/>
-          <w:sz w:val="18"/>
+          <w:i w:val="0"/>
+          <w:color w:val="555555"/>
+          <w:sz w:val="19"/>
         </w:rPr>
-        <w:t>Jajpur, Odisha, India</w:t>
+        <w:tab/>
+        <w:t>2020</w:t>
       </w:r>
     </w:p>
     <w:p>
       <w:pPr>
-        <w:spacing w:after="40" w:before="0"/>
+        <w:tabs>
+          <w:tab w:pos="9360" w:val="right"/>
+        </w:tabs>
+        <w:spacing w:before="40" w:after="0"/>
       </w:pPr>
       <w:r>
         <w:rPr>
-          <w:b/>
-          <w:sz w:val="20"/>
+          <w:rFonts w:ascii="Calibri" w:hAnsi="Calibri" w:eastAsia="Calibri"/>
+          <w:b w:val="0"/>
+          <w:i/>
+          <w:color w:val="333333"/>
+          <w:sz w:val="18"/>
         </w:rPr>
-        <w:t>Primary Education, KANTABANIA HIGH SCHOOL  |  2020 (68.83%)</w:t>
+        <w:t>Kantabania High School</w:t>
       </w:r>
-    </w:p>
-    <w:p>
-      <w:pPr>
-        <w:spacing w:after="40" w:before="0"/>
-      </w:pPr>
       <w:r>
         <w:rPr>
+          <w:rFonts w:ascii="Calibri" w:hAnsi="Calibri" w:eastAsia="Calibri"/>
           <w:b w:val="0"/>
-          <w:sz w:val="18"/>
+          <w:i/>
+          <w:color w:val="555555"/>
+          <w:sz w:val="19"/>
         </w:rPr>
-        <w:t>Jajpur, Odisha, India</w:t>
+        <w:tab/>
+        <w:t>Jajpur, Odisha</w:t>
       </w:r>
     </w:p>
     <w:p>
       <w:pPr>
         <w:spacing w:before="200" w:after="40"/>
+        <w:pBdr>
+          <w:bottom w:val="single" w:sz="12" w:space="1" w:color="1B4F72"/>
+        </w:pBdr>
       </w:pPr>
       <w:r>
         <w:rPr>
+          <w:rFonts w:ascii="Calibri" w:hAnsi="Calibri" w:eastAsia="Calibri"/>
           <w:b/>
-          <w:color w:val="1A365D"/>
+          <w:i w:val="0"/>
+          <w:color w:val="0F2942"/>
           <w:sz w:val="22"/>
         </w:rPr>
         <w:t>SKILLS</w:t>
@@ -240,29 +402,22 @@
     </w:p>
     <w:p>
       <w:pPr>
-        <w:spacing w:before="0" w:after="80"/>
+        <w:spacing w:before="20" w:after="20"/>
       </w:pPr>
       <w:r>
         <w:rPr>
-          <w:color w:val="1A365D"/>
-          <w:sz w:val="12"/>
-        </w:rPr>
-        <w:t>──────────────────────────────────────────────────────────────────────────────</w:t>
-      </w:r>
-    </w:p>
-    <w:p>
-      <w:pPr>
-        <w:spacing w:after="20"/>
-      </w:pPr>
-      <w:r>
-        <w:rPr>
+          <w:rFonts w:ascii="Calibri" w:hAnsi="Calibri" w:eastAsia="Calibri"/>
           <w:b/>
+          <w:i w:val="0"/>
           <w:sz w:val="19"/>
         </w:rPr>
-        <w:t xml:space="preserve">Programming Languages: </w:t>
+        <w:t xml:space="preserve">Programming: </w:t>
       </w:r>
       <w:r>
         <w:rPr>
+          <w:rFonts w:ascii="Calibri" w:hAnsi="Calibri" w:eastAsia="Calibri"/>
+          <w:b w:val="0"/>
+          <w:i w:val="0"/>
           <w:sz w:val="19"/>
         </w:rPr>
         <w:t>C, C++, Python, Java</w:t>
@@ -270,35 +425,45 @@
     </w:p>
     <w:p>
       <w:pPr>
-        <w:spacing w:after="20"/>
+        <w:spacing w:before="20" w:after="20"/>
       </w:pPr>
       <w:r>
         <w:rPr>
+          <w:rFonts w:ascii="Calibri" w:hAnsi="Calibri" w:eastAsia="Calibri"/>
           <w:b/>
+          <w:i w:val="0"/>
           <w:sz w:val="19"/>
         </w:rPr>
         <w:t xml:space="preserve">Web Development: </w:t>
       </w:r>
       <w:r>
         <w:rPr>
+          <w:rFonts w:ascii="Calibri" w:hAnsi="Calibri" w:eastAsia="Calibri"/>
+          <w:b w:val="0"/>
+          <w:i w:val="0"/>
           <w:sz w:val="19"/>
         </w:rPr>
-        <w:t>HTML, CSS, JavaScript, MERN Stack (MongoDB, Express.js, React.js, Node.js), FastAPI</w:t>
+        <w:t>HTML, CSS, JavaScript, React.js, Node.js, Express.js, MongoDB, FastAPI</w:t>
       </w:r>
     </w:p>
     <w:p>
       <w:pPr>
-        <w:spacing w:after="20"/>
+        <w:spacing w:before="20" w:after="20"/>
       </w:pPr>
       <w:r>
         <w:rPr>
+          <w:rFonts w:ascii="Calibri" w:hAnsi="Calibri" w:eastAsia="Calibri"/>
           <w:b/>
+          <w:i w:val="0"/>
           <w:sz w:val="19"/>
         </w:rPr>
-        <w:t xml:space="preserve">Database: </w:t>
+        <w:t xml:space="preserve">Databases: </w:t>
       </w:r>
       <w:r>
         <w:rPr>
+          <w:rFonts w:ascii="Calibri" w:hAnsi="Calibri" w:eastAsia="Calibri"/>
+          <w:b w:val="0"/>
+          <w:i w:val="0"/>
           <w:sz w:val="19"/>
         </w:rPr>
         <w:t>MySQL, SQLite</w:t>
@@ -306,48 +471,63 @@
     </w:p>
     <w:p>
       <w:pPr>
-        <w:spacing w:after="20"/>
+        <w:spacing w:before="20" w:after="20"/>
       </w:pPr>
       <w:r>
         <w:rPr>
+          <w:rFonts w:ascii="Calibri" w:hAnsi="Calibri" w:eastAsia="Calibri"/>
           <w:b/>
+          <w:i w:val="0"/>
           <w:sz w:val="19"/>
         </w:rPr>
-        <w:t xml:space="preserve">Tools &amp; Practices: </w:t>
+        <w:t xml:space="preserve">Tools: </w:t>
       </w:r>
       <w:r>
         <w:rPr>
+          <w:rFonts w:ascii="Calibri" w:hAnsi="Calibri" w:eastAsia="Calibri"/>
+          <w:b w:val="0"/>
+          <w:i w:val="0"/>
           <w:sz w:val="19"/>
         </w:rPr>
-        <w:t>Git &amp; GitHub, REST APIs, AWS S3</w:t>
+        <w:t>Git, GitHub, REST APIs, AWS S3</w:t>
       </w:r>
     </w:p>
     <w:p>
       <w:pPr>
-        <w:spacing w:after="20"/>
+        <w:spacing w:before="20" w:after="20"/>
       </w:pPr>
       <w:r>
         <w:rPr>
+          <w:rFonts w:ascii="Calibri" w:hAnsi="Calibri" w:eastAsia="Calibri"/>
           <w:b/>
+          <w:i w:val="0"/>
           <w:sz w:val="19"/>
         </w:rPr>
         <w:t xml:space="preserve">Soft Skills: </w:t>
       </w:r>
       <w:r>
         <w:rPr>
+          <w:rFonts w:ascii="Calibri" w:hAnsi="Calibri" w:eastAsia="Calibri"/>
+          <w:b w:val="0"/>
+          <w:i w:val="0"/>
           <w:sz w:val="19"/>
         </w:rPr>
-        <w:t>Problem Solving, Logical Thinking, Communication &amp; Teamwork</w:t>
+        <w:t>Problem Solving, Communication, Teamwork</w:t>
       </w:r>
     </w:p>
     <w:p>
       <w:pPr>
         <w:spacing w:before="200" w:after="40"/>
+        <w:pBdr>
+          <w:bottom w:val="single" w:sz="12" w:space="1" w:color="1B4F72"/>
+        </w:pBdr>
       </w:pPr>
       <w:r>
         <w:rPr>
+          <w:rFonts w:ascii="Calibri" w:hAnsi="Calibri" w:eastAsia="Calibri"/>
           <w:b/>
-          <w:color w:val="1A365D"/>
+          <w:i w:val="0"/>
+          <w:color w:val="0F2942"/>
           <w:sz w:val="22"/>
         </w:rPr>
         <w:t>PROJECTS</w:t>
@@ -355,112 +535,121 @@
     </w:p>
     <w:p>
       <w:pPr>
-        <w:spacing w:before="0" w:after="80"/>
+        <w:spacing w:before="80" w:after="20"/>
       </w:pPr>
       <w:r>
         <w:rPr>
-          <w:color w:val="1A365D"/>
-          <w:sz w:val="12"/>
+          <w:rFonts w:ascii="Calibri" w:hAnsi="Calibri" w:eastAsia="Calibri"/>
+          <w:b/>
+          <w:i w:val="0"/>
+          <w:sz w:val="20"/>
         </w:rPr>
-        <w:t>──────────────────────────────────────────────────────────────────────────────</w:t>
+        <w:t>Personal Portfolio Website</w:t>
       </w:r>
     </w:p>
     <w:p>
       <w:pPr>
-        <w:spacing w:after="40" w:before="0"/>
+        <w:spacing w:after="40"/>
       </w:pPr>
       <w:r>
         <w:rPr>
-          <w:b/>
-          <w:sz w:val="20"/>
+          <w:rFonts w:ascii="Calibri" w:hAnsi="Calibri" w:eastAsia="Calibri"/>
+          <w:b w:val="0"/>
+          <w:i w:val="0"/>
+          <w:sz w:val="19"/>
         </w:rPr>
-        <w:t>PERSONAL PORTFOLIO WEBSITE</w:t>
+        <w:t>Designed and developed a personal portfolio website to showcase projects and skills. Technologies: HTML, CSS, JavaScript, Bootstrap</w:t>
       </w:r>
     </w:p>
     <w:p>
       <w:pPr>
-        <w:spacing w:after="40" w:before="0"/>
+        <w:spacing w:before="80" w:after="20"/>
       </w:pPr>
       <w:r>
         <w:rPr>
-          <w:b w:val="0"/>
-          <w:sz w:val="19"/>
-        </w:rPr>
-        <w:t>Designed and developed a personal portfolio website to showcase projects and skills using HTML, CSS, and JavaScript. Technologies Used: HTML, CSS, JavaScript, Bootstrap</w:t>
-      </w:r>
-    </w:p>
-    <w:p>
-      <w:pPr>
-        <w:spacing w:after="40" w:before="0"/>
-      </w:pPr>
-      <w:r>
-        <w:rPr>
+          <w:rFonts w:ascii="Calibri" w:hAnsi="Calibri" w:eastAsia="Calibri"/>
           <w:b/>
+          <w:i w:val="0"/>
           <w:sz w:val="20"/>
         </w:rPr>
-        <w:t>RESOLINE CRM — Full-Stack Business Operations Platform</w:t>
+        <w:t>Resoline CRM — Full-Stack Business Operations Platform</w:t>
       </w:r>
     </w:p>
     <w:p>
       <w:pPr>
         <w:pStyle w:val="ListBullet"/>
-        <w:spacing w:after="40"/>
-        <w:ind w:left="360"/>
+        <w:spacing w:before="20" w:after="20"/>
+        <w:ind w:left="288"/>
       </w:pPr>
       <w:r>
         <w:rPr>
+          <w:rFonts w:ascii="Calibri" w:hAnsi="Calibri" w:eastAsia="Calibri"/>
+          <w:b w:val="0"/>
+          <w:i w:val="0"/>
           <w:sz w:val="19"/>
         </w:rPr>
-        <w:t>Built Resoline CRM, a full-stack business operations platform using React.js, FastAPI (Python), and MySQL, covering leads, customers, employees, and role-based access control.</w:t>
+        <w:t>Built Resoline CRM, a full-stack business operations platform using React.js, FastAPI (Python), and MySQL for leads, customers, employees, and role-based access.</w:t>
       </w:r>
     </w:p>
     <w:p>
       <w:pPr>
         <w:pStyle w:val="ListBullet"/>
-        <w:spacing w:after="40"/>
-        <w:ind w:left="360"/>
+        <w:spacing w:before="20" w:after="20"/>
+        <w:ind w:left="288"/>
       </w:pPr>
       <w:r>
         <w:rPr>
+          <w:rFonts w:ascii="Calibri" w:hAnsi="Calibri" w:eastAsia="Calibri"/>
+          <w:b w:val="0"/>
+          <w:i w:val="0"/>
           <w:sz w:val="19"/>
         </w:rPr>
-        <w:t>Implemented lead and customer management with detailed workspaces, document handling, and AWS S3 file storage for attachments and photos.</w:t>
+        <w:t>Implemented lead and customer management with detailed workspaces, document handling, and AWS S3 storage for attachments and photos.</w:t>
       </w:r>
     </w:p>
     <w:p>
       <w:pPr>
         <w:pStyle w:val="ListBullet"/>
-        <w:spacing w:after="40"/>
-        <w:ind w:left="360"/>
+        <w:spacing w:before="20" w:after="20"/>
+        <w:ind w:left="288"/>
       </w:pPr>
       <w:r>
         <w:rPr>
+          <w:rFonts w:ascii="Calibri" w:hAnsi="Calibri" w:eastAsia="Calibri"/>
+          <w:b w:val="0"/>
+          <w:i w:val="0"/>
           <w:sz w:val="19"/>
         </w:rPr>
-        <w:t>Developed attendance with GPS punch-in/out, late-punch approval workflows, leave management, and a live location tracker on maps for field staff.</w:t>
+        <w:t>Developed attendance with GPS punch-in/out, late-punch approval workflows, leave management, and live map-based location tracking for field staff.</w:t>
       </w:r>
     </w:p>
     <w:p>
       <w:pPr>
         <w:pStyle w:val="ListBullet"/>
-        <w:spacing w:after="40"/>
-        <w:ind w:left="360"/>
+        <w:spacing w:before="20" w:after="20"/>
+        <w:ind w:left="288"/>
       </w:pPr>
       <w:r>
         <w:rPr>
+          <w:rFonts w:ascii="Calibri" w:hAnsi="Calibri" w:eastAsia="Calibri"/>
+          <w:b w:val="0"/>
+          <w:i w:val="0"/>
           <w:sz w:val="19"/>
         </w:rPr>
-        <w:t>Designed a Kanban task board with priorities, due dates, comments, time logs, completion tracking, and file attachments for team collaboration.</w:t>
+        <w:t>Designed a Kanban task board with priorities, due dates, comments, time logs, completion tracking, and file attachments.</w:t>
       </w:r>
     </w:p>
     <w:p>
       <w:pPr>
         <w:pStyle w:val="ListBullet"/>
-        <w:spacing w:after="40"/>
-        <w:ind w:left="360"/>
+        <w:spacing w:before="20" w:after="20"/>
+        <w:ind w:left="288"/>
       </w:pPr>
       <w:r>
         <w:rPr>
+          <w:rFonts w:ascii="Calibri" w:hAnsi="Calibri" w:eastAsia="Calibri"/>
+          <w:b w:val="0"/>
+          <w:i w:val="0"/>
           <w:sz w:val="19"/>
         </w:rPr>
         <w:t>Added inventory and stock management with warehouses, purchase receipts, transfers, weighted-average costing, and reorder alerts.</w:t>
@@ -469,11 +658,14 @@
     <w:p>
       <w:pPr>
         <w:pStyle w:val="ListBullet"/>
-        <w:spacing w:after="40"/>
-        <w:ind w:left="360"/>
+        <w:spacing w:before="20" w:after="20"/>
+        <w:ind w:left="288"/>
       </w:pPr>
       <w:r>
         <w:rPr>
+          <w:rFonts w:ascii="Calibri" w:hAnsi="Calibri" w:eastAsia="Calibri"/>
+          <w:b w:val="0"/>
+          <w:i w:val="0"/>
           <w:sz w:val="19"/>
         </w:rPr>
         <w:t>Built vehicle tracking and fuel expense claims with meter-photo verification, distance/fuel calculation, and admin approval flows.</w:t>
@@ -482,37 +674,48 @@
     <w:p>
       <w:pPr>
         <w:pStyle w:val="ListBullet"/>
-        <w:spacing w:after="40"/>
-        <w:ind w:left="360"/>
+        <w:spacing w:before="20" w:after="20"/>
+        <w:ind w:left="288"/>
       </w:pPr>
       <w:r>
         <w:rPr>
+          <w:rFonts w:ascii="Calibri" w:hAnsi="Calibri" w:eastAsia="Calibri"/>
+          <w:b w:val="0"/>
+          <w:i w:val="0"/>
           <w:sz w:val="19"/>
         </w:rPr>
-        <w:t>Delivered supporting modules for expenses, payroll/salary, operations workspace, service maintenance, dashboards, and monthly reports.</w:t>
+        <w:t>Delivered expenses, payroll/salary, operations workspace, service maintenance, dashboards, and monthly reporting modules.</w:t>
       </w:r>
     </w:p>
     <w:p>
       <w:pPr>
         <w:pStyle w:val="ListBullet"/>
-        <w:spacing w:after="40"/>
-        <w:ind w:left="360"/>
+        <w:spacing w:before="20" w:after="20"/>
+        <w:ind w:left="288"/>
       </w:pPr>
       <w:r>
         <w:rPr>
+          <w:rFonts w:ascii="Calibri" w:hAnsi="Calibri" w:eastAsia="Calibri"/>
+          <w:b w:val="0"/>
+          <w:i w:val="0"/>
           <w:sz w:val="19"/>
         </w:rPr>
-        <w:t>Used JWT authentication, permission-based roles, REST APIs, and responsive UI (Tailwind/Radix) for secure multi-user access across desktop and mobile.</w:t>
+        <w:t>Secured the app with JWT authentication, permission-based roles, REST APIs, and a responsive Tailwind/Radix UI.</w:t>
       </w:r>
     </w:p>
     <w:p>
       <w:pPr>
         <w:spacing w:before="200" w:after="40"/>
+        <w:pBdr>
+          <w:bottom w:val="single" w:sz="12" w:space="1" w:color="1B4F72"/>
+        </w:pBdr>
       </w:pPr>
       <w:r>
         <w:rPr>
+          <w:rFonts w:ascii="Calibri" w:hAnsi="Calibri" w:eastAsia="Calibri"/>
           <w:b/>
-          <w:color w:val="1A365D"/>
+          <w:i w:val="0"/>
+          <w:color w:val="0F2942"/>
           <w:sz w:val="22"/>
         </w:rPr>
         <w:t>CERTIFICATIONS</w:t>
@@ -520,31 +723,21 @@
     </w:p>
     <w:p>
       <w:pPr>
-        <w:spacing w:before="0" w:after="80"/>
+        <w:spacing w:before="80"/>
       </w:pPr>
       <w:r>
         <w:rPr>
-          <w:color w:val="1A365D"/>
-          <w:sz w:val="12"/>
-        </w:rPr>
-        <w:t>──────────────────────────────────────────────────────────────────────────────</w:t>
-      </w:r>
-    </w:p>
-    <w:p>
-      <w:pPr>
-        <w:spacing w:after="40" w:before="0"/>
-      </w:pPr>
-      <w:r>
-        <w:rPr>
+          <w:rFonts w:ascii="Calibri" w:hAnsi="Calibri" w:eastAsia="Calibri"/>
           <w:b w:val="0"/>
+          <w:i w:val="0"/>
           <w:sz w:val="19"/>
         </w:rPr>
-        <w:t>Introduction to Python  |  Full-stack web development  |  Data Analysis</w:t>
+        <w:t>Introduction to Python  |  Full-Stack Web Development  |  Data Analysis</w:t>
       </w:r>
     </w:p>
     <w:sectPr>
       <w:pgSz w:w="12240" w:h="15840"/>
-      <w:pgMar w:top="792" w:right="1008" w:bottom="792" w:left="1008" w:header="720" w:footer="720" w:gutter="0"/>
+      <w:pgMar w:top="720" w:right="1008" w:bottom="720" w:left="1008" w:header="720" w:footer="720" w:gutter="0"/>
       <w:cols w:space="720"/>
       <w:docGrid w:linePitch="360"/>
     </w:sectPr>
@@ -916,7 +1109,7 @@
     <w:qFormat/>
     <w:rsid w:val="00FC693F"/>
     <w:rPr>
-      <w:rFonts w:ascii="Calibri" w:hAnsi="Calibri"/>
+      <w:rFonts w:ascii="Calibri" w:hAnsi="Calibri" w:eastAsia="Calibri"/>
       <w:sz w:val="20"/>
     </w:rPr>
   </w:style>

</xml_diff>